<commit_message>
Add /adobe variant — Forward Deployed AI Engineer
Tailored brochure for Adobe's FDE role at https://adobe.wd5.myworkdayjobs.com/.../Forward-Deployed-AI-Engineer_R158364.

Customer-Embedded eyebrow (matches Adobe's "embed directly" language, distinct
from Anthropic's Forward-Deployed framing). 9-item impact array reorders to lead
with AI matching / AI moderation / 0→1, surfaces a new variant-only "Image GenAI"
outcome at #4 from four years of self-funded home-lab generative-AI work, drops
the Actifio Manual→Automated outcome to keep length at 9. Hello card leads with
FDE shape match, closes with the image-gen credential as nod to Adobe's creative-
tools domain. OG tagline keeps the "including pixels" wink.

Career history, toolkit, systems, and UI strings unchanged.

Co-Authored-By: Claude Opus 4.7 (1M context) <noreply@anthropic.com>
</commit_message>
<xml_diff>
--- a/public/anthropic/leif-taylor-resume-anthropic-2026-05.docx
+++ b/public/anthropic/leif-taylor-resume-anthropic-2026-05.docx
@@ -49,7 +49,7 @@
         </w:rPr>
         <w:t xml:space="preserve">Greater Boston Area  ·  </w:t>
       </w:r>
-      <w:hyperlink w:history="1" r:id="rIdezaxuooscexbkja0eh1ik">
+      <w:hyperlink w:history="1" r:id="rIdy7jclqagxipvgb6myhrnq">
         <w:r>
           <w:rPr>
             <w:rFonts w:ascii="Calibri" w:cs="Calibri" w:eastAsia="Calibri" w:hAnsi="Calibri"/>
@@ -70,7 +70,7 @@
         </w:rPr>
         <w:t xml:space="preserve">  ·  </w:t>
       </w:r>
-      <w:hyperlink w:history="1" r:id="rId8inxnowseshhciuibrulp">
+      <w:hyperlink w:history="1" r:id="rIdfnxzpx2ba9t-lxuhyqhwb">
         <w:r>
           <w:rPr>
             <w:rFonts w:ascii="Calibri" w:cs="Calibri" w:eastAsia="Calibri" w:hAnsi="Calibri"/>
@@ -91,7 +91,7 @@
         </w:rPr>
         <w:t xml:space="preserve">  ·  </w:t>
       </w:r>
-      <w:hyperlink w:history="1" r:id="rId_y-qhy1wepdrqpbaisfeh">
+      <w:hyperlink w:history="1" r:id="rIdredx7l4p39uz7mduq7ch8">
         <w:r>
           <w:rPr>
             <w:rFonts w:ascii="Calibri" w:cs="Calibri" w:eastAsia="Calibri" w:hAnsi="Calibri"/>
@@ -1281,7 +1281,7 @@
       <w:pPr>
         <w:spacing w:after="120"/>
       </w:pPr>
-      <w:hyperlink w:history="1" r:id="rIdrgqi6r7ojhzr0xuf5vdtw">
+      <w:hyperlink w:history="1" r:id="rId4rwnm0wckohu_kzp8lnwv">
         <w:r>
           <w:rPr>
             <w:rFonts w:ascii="Calibri" w:cs="Calibri" w:eastAsia="Calibri" w:hAnsi="Calibri"/>

</xml_diff>